<commit_message>
Clean xuanbisan classification label
</commit_message>
<xml_diff>
--- a/artifacts/desktop_deliverables_20260605/xuanbisan_final_qinghai_fix/选必三思维宝典-飞哥正志讲堂.docx
+++ b/artifacts/desktop_deliverables_20260605/xuanbisan_final_qinghai_fix/选必三思维宝典-飞哥正志讲堂.docx
@@ -5158,7 +5158,7 @@
             <w:szCs w:val="17"/>
             <w:u w:val="none"/>
           </w:rPr>
-          <w:t>13. 2024各区一模分类汇编·房山未来产业题</w:t>
+          <w:t>13. 房山未来产业题</w:t>
         </w:r>
         <w:r>
           <w:rPr>
@@ -31539,7 +31539,7 @@
           <w:sz w:val="23"/>
           <w:szCs w:val="23"/>
         </w:rPr>
-        <w:t xml:space="preserve">13. 2024各区一模分类汇编·房山未来产业题</w:t>
+        <w:t xml:space="preserve">13. 房山未来产业题</w:t>
       </w:r>
       <w:bookmarkEnd w:id="148"/>
     </w:p>

</xml_diff>

<commit_message>
Unify fangshan future industry title
</commit_message>
<xml_diff>
--- a/artifacts/desktop_deliverables_20260605/xuanbisan_final_qinghai_fix/选必三思维宝典-飞哥正志讲堂.docx
+++ b/artifacts/desktop_deliverables_20260605/xuanbisan_final_qinghai_fix/选必三思维宝典-飞哥正志讲堂.docx
@@ -5158,7 +5158,7 @@
             <w:szCs w:val="17"/>
             <w:u w:val="none"/>
           </w:rPr>
-          <w:t>13. 房山未来产业题</w:t>
+          <w:t>13. 2024房山一模 第20题第（1）问</w:t>
         </w:r>
         <w:r>
           <w:rPr>
@@ -31539,7 +31539,7 @@
           <w:sz w:val="23"/>
           <w:szCs w:val="23"/>
         </w:rPr>
-        <w:t xml:space="preserve">13. 房山未来产业题</w:t>
+        <w:t xml:space="preserve">13. 2024房山一模 第20题第（1）问</w:t>
       </w:r>
       <w:bookmarkEnd w:id="148"/>
     </w:p>

</xml_diff>